<commit_message>
Add ML feedback loop framework and fix konkurs chart export.
Introduce ml/ skeleton, export_training_feedback.py, and BP section 17 on continuous fine-tuning; fix Plotly 5 + Kaleido 1.3 PNG export with kaleido.write_fig fallback and matplotlib backup; regenerate konkurs PDFs and charts.

Co-authored-by: Cursor <cursoragent@cursor.com>
</commit_message>
<xml_diff>
--- a/docs/konkurs/03_Biznes_plan_Kravira_Protocol.docx
+++ b/docs/konkurs/03_Biznes_plan_Kravira_Protocol.docx
@@ -420,7 +420,9 @@
         <w:br/>
         <w:t>8. Потребители и сбыт ...................................... 19</w:t>
         <w:br/>
-        <w:t>9. Ценообразование ......................................... 21</w:t>
+        <w:t>8.1. B2C UX-сценарии (пилот) ............................... 21</w:t>
+        <w:br/>
+        <w:t>9. Ценообразование ......................................... 22</w:t>
         <w:br/>
         <w:t>10. Конкуренты ............................................. 24</w:t>
         <w:br/>
@@ -436,8 +438,14 @@
         <w:br/>
         <w:t>16. Иные сведения .......................................... 36</w:t>
         <w:br/>
+        <w:t>17. Непрерывное дообучение моделей ......................... 38</w:t>
+        <w:br/>
         <w:br/>
         <w:t>Приложения А-Ж: прайс, дорожная карта, KPI, графики, ROI, рынок РБ</w:t>
+        <w:br/>
+        <w:t>Приложение И: ML-контур и MLOps (ml/, export_training_feedback.py)</w:t>
+        <w:br/>
+        <w:t>Глоссарий: TAM, SAM, SOM, B2B, B2C, EBITDA - расшифровки и сверка формул</w:t>
         <w:br/>
         <w:t>Электронные приложения: 05_Biznes_plan_Prilozheniya.html, 06_ROI_Kravira.html</w:t>
         <w:br/>
@@ -478,22 +486,19 @@
         </w:rPr>
       </w:pPr>
       <w:r>
-        <w:t>Идея проекта. Автоматизировать предимпортную экспертизу консультативных заключений (КЗ) до подписи ЭЦП в частных медицинских организациях Республики Беларусь и предоставить физическим лицам сервис самопроверки качества оказанной помощи по официальным клиническим протоколам Минздрава.</w:t>
-        <w:br/>
-        <w:br/>
-        <w:t>Проблема и возможность. В РБ действует порядка 478 клинических протоколов; рынок платных медуслуг оценивается в ~2,7 млрд BYN в 2025 г. (+24% г/г). Доля частного сектора в платном сегменте - 70-81%. МЦ «Кравира» формирует 25 000 КЗ/мес - по оценке участника это ~1% платных консультаций частного сектора, откуда адресуемый рынок ~2,5 млн КЗ/мес (30 млн/год). Методслужба не успевает проверять каждое заключение; отклонения пакетов в ЦИСЗ создают репутационные и финансовые риски.</w:t>
-        <w:br/>
-        <w:br/>
-        <w:t>Решение. Программный комплекс Protocol: детерминированный scoring (482+ правил, 8 блоков), чек-лист готовности к ЦИСЗ (FHIR BY), единое решение send_gate для МИС. LLM - только пояснения; блокировка подписи - по правилам.</w:t>
-        <w:br/>
-        <w:br/>
-        <w:t>Монетизация (три канала). B2B: 0,99 / 0,79 / 0,69 BYN за проверку L0 (якорь Кравира - 207 тыс. BYN/год). B2B API: лицензия МИС «Айболит». B2C: 4,99 / 9,99 BYN для физлиц.</w:t>
-        <w:br/>
-        <w:br/>
-        <w:t>Финансовый вывод. Год 3: выручка ~2,33 млн BYN, EBITDA +1,68 млн при 8% рынка (200 000 КЗ/мес). Точка безубыточности направления - 2-3 клиники уровня «Клиника» или OEM API.</w:t>
-        <w:br/>
-        <w:br/>
-        <w:t>Запрос. Сертификат ГКНТ (571 б.в., ~24 тыс. BYN) на интеграцию МИС, on-prem L0, масштабирование на 5-10 частных ОЗ к 2028 г.</w:t>
+        <w:t>Идея проекта. Автоматизировать предимпортную экспертизу консультативных заключений (КЗ) до подписи ЭЦП в частных медицинских организациях Республики Беларусь и предоставить всем пациентам частного сектора сервис проверки своего КЗ по официальным клиническим протоколам Минздрава (478 документов).</w:t>
+        <w:br/>
+        <w:br/>
+        <w:t>Масштаб рынка. МЦ «Кравира» (25 000 КЗ/мес) - якорь и пилот (~1% рынка), но продукт адресован всему сегменту частных ОЗ РБ: ~2,5 млн КЗ/мес, 30 млн/год, ~2,7 млрд BYN платных медуслуг (2025). B2B масштабируется на 3-8 клиник к 2029 г.; B2C - на любого пациента, получившего КЗ в партнёрской или любой частной ОЗ.</w:t>
+        <w:br/>
+        <w:br/>
+        <w:t>Решение. Protocol: scoring 482+ правил, ЦИСЗ FHIR BY, send_gate для МИС. Три канала: B2B (0,69-0,99 BYN/КЗ), API МИС, B2C с tier-ценами 4,99-14,99 BYN (терапия → онкология/pre-op) и rev-share 30% клинике при оплате по ссылке.</w:t>
+        <w:br/>
+        <w:br/>
+        <w:t>Финансовый вывод. Осторожный план 2029: выручка ~2,32 млн BYN, EBITDA ~+1,67 млн/год (~139 тыс./мес). Расширенный сценарий (+8 каналов: L2, подписка методслужбы, обучение, OEM, медтуризм, корпоративные аудиты): выручка до ~3,5 млн, EBITDA до ~2,5 млн/год (~205 тыс./мес).</w:t>
+        <w:br/>
+        <w:br/>
+        <w:t>Запрос. Сертификат ГКНТ (~24 тыс. BYN) на интеграцию МИС и масштабирование на сеть частных ОЗ РБ.</w:t>
       </w:r>
     </w:p>
     <w:p>
@@ -529,6 +534,17 @@
         <w:br/>
         <w:br/>
         <w:t>Ожидаемый эффект для отрасли: снижение доли отклонённых пакетов ЦИСЗ, повышение прозрачности качества помощи для пациентов, высвобождение 0,3-0,5 FTE методиста на крупную клинику.</w:t>
+        <w:br/>
+        <w:br/>
+        <w:t>Социальная значимость (подробно - раздел «Социальная значимость» в PDF-версии бизнес-плана):</w:t>
+        <w:br/>
+        <w:t>- Пациенты получают B2C-инструмент проверки КЗ по 478 протоколам Минздрава с цитатами из стандарта.</w:t>
+        <w:br/>
+        <w:t>- Врачи - подсказку L0 &lt;2 с до ЭЦП, без «чёрного ящика» LLM в решении send_gate.</w:t>
+        <w:br/>
+        <w:t>- Медцентры - 100% охват потока вместо 2-5% выборочного аудита; единый контур клиника + ЦИСЗ.</w:t>
+        <w:br/>
+        <w:t>- Государство - более качественные данные в ЦИСЗ и исполнение клинических протоколов на амбулаторном уровне.</w:t>
       </w:r>
     </w:p>
     <w:p>
@@ -573,7 +589,10 @@
         <w:t>Технология: Python/FastAPI, гибридный RAG, детерминированные правила; опционально LLM для L2. Развёртывание в защищённом контуре РБ (см. architecture-kravira-fhir-mis.pdf). Серверные требования: 2-4 GB RAM на площадку, Docker.</w:t>
         <w:br/>
         <w:br/>
-        <w:t>Жизненный цикл продукта: еженедельная синхронизация корпуса КП Минздрава; ежемесячные релизы правил; квартальный аудит методистом.</w:t>
+        <w:t>Жизненный цикл продукта: еженедельная синхронизация корпуса КП Минздрава; ежемесячные релизы правил; квартальный аудит методистом; непрерывное дообучение локальных моделей (см. раздел «Непрерывное дообучение» и каталог ml/).</w:t>
+        <w:br/>
+        <w:br/>
+        <w:t>Архитектура ML: детерминированное ядро (send_gate) + дообучаемые embedder/reranker/entailment в контуре РБ; сбор feedback data/ml/feedback/; экспорт scripts/export_training_feedback.py.</w:t>
       </w:r>
     </w:p>
     <w:p>
@@ -618,13 +637,16 @@
         <w:t>B2B-сегмент: частные ОЗ. МЦ «Кравира» - 25 000 КЗ/мес, ~1% рынка частных ОЗ, отсюда оценка сегмента ~2,5 млн КЗ/мес (~30 млн/год). SAM (5% TAM, клиники с потоком &gt;5 000 КЗ/мес и готовностью к ЦИСЗ) - 1,5 млн КЗ/год. SOM год 3 - 2,4 млн КЗ/год (8% TAM).</w:t>
         <w:br/>
         <w:br/>
-        <w:t>B2C-сегмент: получатели КЗ в частных ОЗ (~30 млн касаний/год). При конверсии 0,1% - 30 000 платных проверок × 4,99 BYN ≈ 150 тыс. BYN/год; при 0,5% - 750 тыс. BYN/год дополнительно к B2B. Воронка: QR на чеке → landing → оплата ERIP.</w:t>
-        <w:br/>
-        <w:br/>
-        <w:t>Маркетинг B2B: кейс Кравиры с ROI (экономия методиста + снижение доработок ЦИСЗ); конференции ЦИСЗ/Минздрава; прямые продажи; партнёрство с EPAM/Айболит (OEM API); пилот 1-3 месяца с KPI.</w:t>
-        <w:br/>
-        <w:br/>
-        <w:t>Маркетинг B2C: QR «Проверить заключение»; SEO «как читать КЗ»; соцсети; white-label от клиник-партнёров (промо 2,99 BYN).</w:t>
+        <w:t>B2C-сегмент: все пациенты частных ОЗ РБ (~30 млн получений КЗ/год). МЦ «Кравира» - первый white-label партнёр; масштаб - любая частная клиника и любой пациент с PDF КЗ. Tier-цены 4,99-14,99 BYN (терапия → онкология/pre-op); средний чек пациента ~8,33 BYN (микс tier). Rev-share 30% клинике при оплате по SMS/QR-ссылке - доп. доход ОЗ без затрат на методиста.</w:t>
+        <w:br/>
+        <w:br/>
+        <w:t>Конверсия B2C (осторожный сценарий): 0,02% TAM в год 1 (~6,7 тыс. проверок), 0,23% в год 3 (~69,6 тыс.) → выручка Protocol ~440 тыс. BYN (~6,33 BYN Protocol/проверка с учётом rev-share 30%). Базовый 0,33% TAM - ~626 тыс. BYN B2C; оптимистичный 0,5% - ~949 тыс. BYN.</w:t>
+        <w:br/>
+        <w:br/>
+        <w:t>Маркетинг B2B: кейс Кравиры с ROI; конференции ЦИСЗ/Минздрава; прямые продажи в сети частных ОЗ Минска и регионов; OEM через EPAM/Айболит.</w:t>
+        <w:br/>
+        <w:br/>
+        <w:t>Маркетинг B2C: QR «Проверить заключение»; SMS со ссылкой от клиники (rev-share); SEO «проверить КЗ Беларусь»; tier-прайс по specialty.</w:t>
         <w:br/>
         <w:br/>
         <w:t>Тренды: ужесточение требований ЦИСЗ; дефицит методистов; принятие ИИ при прозрачном детерминированном scoring; рост частных центров ~20%/год в Минске.</w:t>
@@ -1074,7 +1096,7 @@
       <w:r>
         <w:drawing>
           <wp:inline xmlns:a="http://schemas.openxmlformats.org/drawingml/2006/main" xmlns:pic="http://schemas.openxmlformats.org/drawingml/2006/picture">
-            <wp:extent cx="5303520" cy="2868328"/>
+            <wp:extent cx="5303520" cy="2845791"/>
             <wp:docPr id="1" name="Picture 1"/>
             <wp:cNvGraphicFramePr>
               <a:graphicFrameLocks noChangeAspect="1"/>
@@ -1095,7 +1117,7 @@
                   <pic:spPr>
                     <a:xfrm>
                       <a:off x="0" y="0"/>
-                      <a:ext cx="5303520" cy="2868328"/>
+                      <a:ext cx="5303520" cy="2845791"/>
                     </a:xfrm>
                     <a:prstGeom prst="rect"/>
                   </pic:spPr>
@@ -1699,7 +1721,7 @@
       <w:r>
         <w:drawing>
           <wp:inline xmlns:a="http://schemas.openxmlformats.org/drawingml/2006/main" xmlns:pic="http://schemas.openxmlformats.org/drawingml/2006/picture">
-            <wp:extent cx="5303520" cy="2859079"/>
+            <wp:extent cx="5303520" cy="2845791"/>
             <wp:docPr id="2" name="Picture 2"/>
             <wp:cNvGraphicFramePr>
               <a:graphicFrameLocks noChangeAspect="1"/>
@@ -1720,7 +1742,7 @@
                   <pic:spPr>
                     <a:xfrm>
                       <a:off x="0" y="0"/>
-                      <a:ext cx="5303520" cy="2859079"/>
+                      <a:ext cx="5303520" cy="2845791"/>
                     </a:xfrm>
                     <a:prstGeom prst="rect"/>
                   </pic:spPr>
@@ -2042,22 +2064,22 @@
         </w:rPr>
       </w:pPr>
       <w:r>
-        <w:t>Основные потребители B2B: частные медицинские центры и сети ОЗ; методслужбы; вендоры МИС (Айболит/EPAM). Якорный потребитель - МЦ «Кравира» (~25 000 КЗ/мес, 207 тыс. BYN/год B2B).</w:t>
-        <w:br/>
-        <w:br/>
-        <w:t>Сегментация B2B: (1) крупные сети 25k+ КЗ/мес - тариф «Сеть» 0,69 BYN; (2) клиники 5-10k - «Клиника» 0,79 BYN; (3) малые ОЗ до 1k - «Старт» 0,99 BYN; (4) OEM через МИС - лицензия + внедрение.</w:t>
-        <w:br/>
-        <w:br/>
-        <w:t>Потребители B2C: физические лица - пациенты частных клиник, желающие проверить своё консультативное заключение на соответствие клиническим протоколам Минздрава; вторичный сегмент - родственники пациентов и медтуристы.</w:t>
-        <w:br/>
-        <w:br/>
-        <w:t>Сбытовая политика B2B: прямые договоры; пакетные тарифы; OEM/API для МИС; пилот 1-3 месяца с метриками отказов ЦИСЗ; минимальные обязательства по объёму для скидки.</w:t>
-        <w:br/>
-        <w:br/>
-        <w:t>Сбытовая политика B2C: публичная веб-витрина; ERIP и банковские карты; промо через клиники-партнёры (white-label, скидка 2,99 BYN); QR-код на выдаваемом пациенту КЗ.</w:t>
-        <w:br/>
-        <w:br/>
-        <w:t>Каналы продвижения: личные продажи (B2B), партнёрская программа с клиниками (rev-share на B2C), контент-маркетинг, участие в конкурсе Белинфонд для PR.</w:t>
+        <w:t>Основные потребители B2B: все частные медицинские центры и сети ОЗ Республики Беларусь; методслужбы; вендоры МИС. Якорный пилот - МЦ «Кравира» (~25 000 КЗ/мес, 207 тыс. BYN/год B2B); к 2029 г. - 8 клиник (1,59 млн BYN B2B помимо Кравиры).</w:t>
+        <w:br/>
+        <w:br/>
+        <w:t>Сегментация B2B: (1) крупные сети 25k+ КЗ/мес - «Сеть» 0,69 BYN; (2) клиники 5-10k - «Клиника» 0,79 BYN; (3) малые ОЗ - «Старт» 0,99 BYN; (4) OEM через МИС.</w:t>
+        <w:br/>
+        <w:br/>
+        <w:t>Потребители B2C: все физические лица - пациенты любой частной клиники РБ, желающие проверить КЗ по протоколам Минздрава; родственники; медтуристы.</w:t>
+        <w:br/>
+        <w:br/>
+        <w:t>Сбытовая политика B2C: веб-витрина protocol.by/check; ERIP и карты; SMS/email со ссылкой от клиники (rev-share 30/70); QR на выдаваемом КЗ; tier-цены по specialty (онкология 14,99, pre-op 12,99 BYN).</w:t>
+        <w:br/>
+        <w:br/>
+        <w:t>Каналы продвижения: личные продажи B2B по сети частных ОЗ; партнёрская программа B2B2C (клиника рассылает ссылку - получает 30% оплаты); контент-маркетинг; конкурс Белинфонд для PR.</w:t>
+        <w:br/>
+        <w:br/>
+        <w:t>B2C UX: три сценария - QR после визита (любая ОЗ-партнёр), SMS со ссылкой (rev-share), национальный вход SEO. Подробно - раздел 8.1 PDF.</w:t>
       </w:r>
     </w:p>
     <w:p>
@@ -2540,20 +2562,30 @@
         <w:t>- Внедрение API в МИС: 15-40 тыс. BYN разово + поддержка 3-5 тыс. BYN/год</w:t>
         <w:br/>
         <w:br/>
-        <w:t>B2C (физические лица):</w:t>
-        <w:br/>
-        <w:t>- Базовая проверка L1: 4,99 BYN</w:t>
-        <w:br/>
-        <w:t>- Подробный отчёт L2: 9,99 BYN</w:t>
-        <w:br/>
-        <w:t>- Абонемент 3 проверки/мес: 12,99 BYN</w:t>
-        <w:br/>
-        <w:t>- Промо от клиники-партнёра: 2,99 BYN</w:t>
-        <w:br/>
-        <w:br/>
         <w:t>Себестоимость L0 B2B: ~0,06-0,12 BYN/КЗ (маржа 85-94% при 0,99 BYN; 83-91% при 0,69 BYN).</w:t>
         <w:br/>
-        <w:t>Себестоимость B2C L1: ~0,15-0,25 BYN (обработка PDF, без долгого хранения ПДн).</w:t>
+        <w:br/>
+        <w:t>B2C (физические лица, tier по specialty):</w:t>
+        <w:br/>
+        <w:t>- Базовый L1 (терапия, простой приём): 4,99 BYN</w:t>
+        <w:br/>
+        <w:t>- Расширенный L1+ (специалист + анализы в КЗ): 6,99 BYN</w:t>
+        <w:br/>
+        <w:t>- Стандарт L2 (подробный разбор): 9,99 BYN</w:t>
+        <w:br/>
+        <w:t>- Онкология L2 (онко, ЗНО, хроника): 14,99 BYN</w:t>
+        <w:br/>
+        <w:t>- Предоперационный L2 (pre-op, высокий риск): 12,99 BYN</w:t>
+        <w:br/>
+        <w:t>- Промо по ссылке клиники (SMS/QR): 2,99 BYN → upsell на tier</w:t>
+        <w:br/>
+        <w:t>- Rev-share: 30% оплаты - клинике-партнёру, 70% - Protocol</w:t>
+        <w:br/>
+        <w:br/>
+        <w:t>Средний чек B2C (микс tier): ~8,33 BYN. Выручка Protocol с проверки ~6,33 BYN (80% канал rev-share × 70% + 20% прямой). Пример: онко 14,99 → клинике 4,50 BYN, Protocol 10,49 BYN.</w:t>
+        <w:br/>
+        <w:br/>
+        <w:t>Себестоимость B2C L1: ~0,15-0,25 BYN (PDF, без хранения ПДн). Валовая маржа Protocol после rev-share: 65-85% в зависимости от tier.</w:t>
         <w:br/>
         <w:br/>
         <w:t>Обоснование цены: ручной аудит методистом - эквивалент ~34 BYN/проверенное КЗ при охвате 2-5% потока; Protocol L0 - 0,69 BYN при 100% охвате.</w:t>
@@ -3708,7 +3740,7 @@
       <w:r>
         <w:drawing>
           <wp:inline xmlns:a="http://schemas.openxmlformats.org/drawingml/2006/main" xmlns:pic="http://schemas.openxmlformats.org/drawingml/2006/picture">
-            <wp:extent cx="5303520" cy="2380093"/>
+            <wp:extent cx="5303520" cy="2845791"/>
             <wp:docPr id="3" name="Picture 3"/>
             <wp:cNvGraphicFramePr>
               <a:graphicFrameLocks noChangeAspect="1"/>
@@ -3729,7 +3761,7 @@
                   <pic:spPr>
                     <a:xfrm>
                       <a:off x="0" y="0"/>
-                      <a:ext cx="5303520" cy="2380093"/>
+                      <a:ext cx="5303520" cy="2845791"/>
                     </a:xfrm>
                     <a:prstGeom prst="rect"/>
                   </pic:spPr>
@@ -3757,7 +3789,7 @@
       <w:r>
         <w:drawing>
           <wp:inline xmlns:a="http://schemas.openxmlformats.org/drawingml/2006/main" xmlns:pic="http://schemas.openxmlformats.org/drawingml/2006/picture">
-            <wp:extent cx="5303520" cy="2838577"/>
+            <wp:extent cx="5303520" cy="2845791"/>
             <wp:docPr id="4" name="Picture 4"/>
             <wp:cNvGraphicFramePr>
               <a:graphicFrameLocks noChangeAspect="1"/>
@@ -3778,7 +3810,7 @@
                   <pic:spPr>
                     <a:xfrm>
                       <a:off x="0" y="0"/>
-                      <a:ext cx="5303520" cy="2838577"/>
+                      <a:ext cx="5303520" cy="2845791"/>
                     </a:xfrm>
                     <a:prstGeom prst="rect"/>
                   </pic:spPr>
@@ -5777,13 +5809,16 @@
         <w:t>Исходное допущение рынка: 25 000 КЗ/мес в Кравире = 1% платных КЗ частного сектора РБ, адресуемый рынок 2,5 млн КЗ/мес (30 млн/год).</w:t>
         <w:br/>
         <w:br/>
-        <w:t>Доходы год 1 (2027): B2B Кравира 207 тыс. + B2C beta 50 тыс. = 257 тыс. BYN; OPEX 280 тыс.; EBITDA -23 тыс. (инвестиционная фаза).</w:t>
-        <w:br/>
-        <w:br/>
-        <w:t>Доходы год 2 (2028): B2B 675 + B2C 180 + API 25 = 880 тыс. BYN; OPEX 420 тыс.; EBITDA +460 тыс. (3% рынка, 75 000 КЗ/мес).</w:t>
-        <w:br/>
-        <w:br/>
-        <w:t>Доходы год 3 (2029): B2B 1 800 + B2C 450 + API 75 = 2 325 тыс. BYN; OPEX 650 тыс.; EBITDA +1 675 тыс. (8% рынка, 200 000 КЗ/мес).</w:t>
+        <w:t>Доходы год 1 (2027): B2B Кравира 207 + B2C 42 = 249 тыс. BYN; OPEX 280 тыс.; EBITDA −31 тыс. (~−2,6 тыс./мес).</w:t>
+        <w:br/>
+        <w:br/>
+        <w:t>Доходы год 2 (2028): B2B 675 + B2C 152 + API 25 = 852 тыс. BYN; OPEX 420 тыс.; EBITDA +432 тыс. (~+36 тыс./мес, 3% TAM B2B).</w:t>
+        <w:br/>
+        <w:br/>
+        <w:t>Доходы год 3 (2029), осторожный: B2B 1 800 + B2C 440 + API 75 = 2 315 тыс. BYN; OPEX 650 тыс.; EBITDA +1 665 тыс. (~+139 тыс./мес, 8% TAM B2B = 200 тыс. КЗ/мес из 2,5 млн). Базовый (10% TAM): EBITDA ~+2 256 тыс.; оптимистичный (12%): ~+2 949 тыс.</w:t>
+        <w:br/>
+        <w:br/>
+        <w:t>Пояснение TAM vs EBITDA: теоретический потолок B2B при 100% TAM - ~22,5 млн BYN/год; план 2029 использует 8% проникновения - это сознательно осторожная модель, не недооценка рынка.</w:t>
         <w:br/>
         <w:br/>
         <w:t>Структура OPEX: ФОТ 64%, инфраструктура 13%, маркетинг 13%, прочее 10% (см. таблицу 11 и график OPEX).</w:t>
@@ -5795,7 +5830,7 @@
         <w:t>ROI якорного клиента - приложение Ж (06_ROI_Kravira.html): экономия ~3,5 тыс. BYN/мес vs затраты 17,25 тыс. BYN/мес на Protocol при полном охвате - окупаемость через снижение доработок ЦИСЗ и высвобождение методиста.</w:t>
         <w:br/>
         <w:br/>
-        <w:t>Cash flow: отрицательный в 2027 (-23 тыс. EBITDA), положительный с 2028 (+460 тыс., +1 675 тыс.).</w:t>
+        <w:t>Cash flow: отрицательный в 2027 (−31 тыс. EBITDA), положительный с 2028 (+432 тыс., +1 665 тыс. осторожный / до +2 949 тыс. оптимистичный).</w:t>
       </w:r>
     </w:p>
     <w:p>
@@ -6186,39 +6221,39 @@
                 <w:b w:val="0"/>
                 <w:sz w:val="18"/>
               </w:rPr>
-              <w:t>50</w:t>
-            </w:r>
-          </w:p>
-        </w:tc>
-        <w:tc>
-          <w:tcPr>
-            <w:tcW w:type="dxa" w:w="2410"/>
-            <w:shd w:fill="FFFFFF" w:val="clear"/>
-          </w:tcPr>
-          <w:p>
-            <w:r/>
-            <w:r>
-              <w:rPr>
-                <w:b w:val="0"/>
-                <w:sz w:val="18"/>
-              </w:rPr>
-              <w:t>180</w:t>
-            </w:r>
-          </w:p>
-        </w:tc>
-        <w:tc>
-          <w:tcPr>
-            <w:tcW w:type="dxa" w:w="2410"/>
-            <w:shd w:fill="FFFFFF" w:val="clear"/>
-          </w:tcPr>
-          <w:p>
-            <w:r/>
-            <w:r>
-              <w:rPr>
-                <w:b w:val="0"/>
-                <w:sz w:val="18"/>
-              </w:rPr>
-              <w:t>450</w:t>
+              <w:t>42</w:t>
+            </w:r>
+          </w:p>
+        </w:tc>
+        <w:tc>
+          <w:tcPr>
+            <w:tcW w:type="dxa" w:w="2410"/>
+            <w:shd w:fill="FFFFFF" w:val="clear"/>
+          </w:tcPr>
+          <w:p>
+            <w:r/>
+            <w:r>
+              <w:rPr>
+                <w:b w:val="0"/>
+                <w:sz w:val="18"/>
+              </w:rPr>
+              <w:t>152</w:t>
+            </w:r>
+          </w:p>
+        </w:tc>
+        <w:tc>
+          <w:tcPr>
+            <w:tcW w:type="dxa" w:w="2410"/>
+            <w:shd w:fill="FFFFFF" w:val="clear"/>
+          </w:tcPr>
+          <w:p>
+            <w:r/>
+            <w:r>
+              <w:rPr>
+                <w:b w:val="0"/>
+                <w:sz w:val="18"/>
+              </w:rPr>
+              <w:t>440</w:t>
             </w:r>
           </w:p>
         </w:tc>
@@ -6318,39 +6353,39 @@
                 <w:b w:val="0"/>
                 <w:sz w:val="18"/>
               </w:rPr>
-              <w:t>257</w:t>
-            </w:r>
-          </w:p>
-        </w:tc>
-        <w:tc>
-          <w:tcPr>
-            <w:tcW w:type="dxa" w:w="2410"/>
-            <w:shd w:fill="FFFFFF" w:val="clear"/>
-          </w:tcPr>
-          <w:p>
-            <w:r/>
-            <w:r>
-              <w:rPr>
-                <w:b w:val="0"/>
-                <w:sz w:val="18"/>
-              </w:rPr>
-              <w:t>880</w:t>
-            </w:r>
-          </w:p>
-        </w:tc>
-        <w:tc>
-          <w:tcPr>
-            <w:tcW w:type="dxa" w:w="2410"/>
-            <w:shd w:fill="FFFFFF" w:val="clear"/>
-          </w:tcPr>
-          <w:p>
-            <w:r/>
-            <w:r>
-              <w:rPr>
-                <w:b w:val="0"/>
-                <w:sz w:val="18"/>
-              </w:rPr>
-              <w:t>2325</w:t>
+              <w:t>249</w:t>
+            </w:r>
+          </w:p>
+        </w:tc>
+        <w:tc>
+          <w:tcPr>
+            <w:tcW w:type="dxa" w:w="2410"/>
+            <w:shd w:fill="FFFFFF" w:val="clear"/>
+          </w:tcPr>
+          <w:p>
+            <w:r/>
+            <w:r>
+              <w:rPr>
+                <w:b w:val="0"/>
+                <w:sz w:val="18"/>
+              </w:rPr>
+              <w:t>852</w:t>
+            </w:r>
+          </w:p>
+        </w:tc>
+        <w:tc>
+          <w:tcPr>
+            <w:tcW w:type="dxa" w:w="2410"/>
+            <w:shd w:fill="FFFFFF" w:val="clear"/>
+          </w:tcPr>
+          <w:p>
+            <w:r/>
+            <w:r>
+              <w:rPr>
+                <w:b w:val="0"/>
+                <w:sz w:val="18"/>
+              </w:rPr>
+              <w:t>2315</w:t>
             </w:r>
           </w:p>
         </w:tc>
@@ -6450,39 +6485,39 @@
                 <w:b w:val="0"/>
                 <w:sz w:val="18"/>
               </w:rPr>
-              <w:t>-23</w:t>
-            </w:r>
-          </w:p>
-        </w:tc>
-        <w:tc>
-          <w:tcPr>
-            <w:tcW w:type="dxa" w:w="2410"/>
-            <w:shd w:fill="FFFFFF" w:val="clear"/>
-          </w:tcPr>
-          <w:p>
-            <w:r/>
-            <w:r>
-              <w:rPr>
-                <w:b w:val="0"/>
-                <w:sz w:val="18"/>
-              </w:rPr>
-              <w:t>+460</w:t>
-            </w:r>
-          </w:p>
-        </w:tc>
-        <w:tc>
-          <w:tcPr>
-            <w:tcW w:type="dxa" w:w="2410"/>
-            <w:shd w:fill="FFFFFF" w:val="clear"/>
-          </w:tcPr>
-          <w:p>
-            <w:r/>
-            <w:r>
-              <w:rPr>
-                <w:b w:val="0"/>
-                <w:sz w:val="18"/>
-              </w:rPr>
-              <w:t>+1675</w:t>
+              <w:t>-31</w:t>
+            </w:r>
+          </w:p>
+        </w:tc>
+        <w:tc>
+          <w:tcPr>
+            <w:tcW w:type="dxa" w:w="2410"/>
+            <w:shd w:fill="FFFFFF" w:val="clear"/>
+          </w:tcPr>
+          <w:p>
+            <w:r/>
+            <w:r>
+              <w:rPr>
+                <w:b w:val="0"/>
+                <w:sz w:val="18"/>
+              </w:rPr>
+              <w:t>+432</w:t>
+            </w:r>
+          </w:p>
+        </w:tc>
+        <w:tc>
+          <w:tcPr>
+            <w:tcW w:type="dxa" w:w="2410"/>
+            <w:shd w:fill="FFFFFF" w:val="clear"/>
+          </w:tcPr>
+          <w:p>
+            <w:r/>
+            <w:r>
+              <w:rPr>
+                <w:b w:val="0"/>
+                <w:sz w:val="18"/>
+              </w:rPr>
+              <w:t>+1665</w:t>
             </w:r>
           </w:p>
         </w:tc>
@@ -7369,39 +7404,39 @@
                 <w:b w:val="0"/>
                 <w:sz w:val="18"/>
               </w:rPr>
-              <w:t>-23</w:t>
-            </w:r>
-          </w:p>
-        </w:tc>
-        <w:tc>
-          <w:tcPr>
-            <w:tcW w:type="dxa" w:w="2410"/>
-            <w:shd w:fill="FFFFFF" w:val="clear"/>
-          </w:tcPr>
-          <w:p>
-            <w:r/>
-            <w:r>
-              <w:rPr>
-                <w:b w:val="0"/>
-                <w:sz w:val="18"/>
-              </w:rPr>
-              <w:t>+460</w:t>
-            </w:r>
-          </w:p>
-        </w:tc>
-        <w:tc>
-          <w:tcPr>
-            <w:tcW w:type="dxa" w:w="2410"/>
-            <w:shd w:fill="FFFFFF" w:val="clear"/>
-          </w:tcPr>
-          <w:p>
-            <w:r/>
-            <w:r>
-              <w:rPr>
-                <w:b w:val="0"/>
-                <w:sz w:val="18"/>
-              </w:rPr>
-              <w:t>+1675</w:t>
+              <w:t>-31</w:t>
+            </w:r>
+          </w:p>
+        </w:tc>
+        <w:tc>
+          <w:tcPr>
+            <w:tcW w:type="dxa" w:w="2410"/>
+            <w:shd w:fill="FFFFFF" w:val="clear"/>
+          </w:tcPr>
+          <w:p>
+            <w:r/>
+            <w:r>
+              <w:rPr>
+                <w:b w:val="0"/>
+                <w:sz w:val="18"/>
+              </w:rPr>
+              <w:t>+432</w:t>
+            </w:r>
+          </w:p>
+        </w:tc>
+        <w:tc>
+          <w:tcPr>
+            <w:tcW w:type="dxa" w:w="2410"/>
+            <w:shd w:fill="FFFFFF" w:val="clear"/>
+          </w:tcPr>
+          <w:p>
+            <w:r/>
+            <w:r>
+              <w:rPr>
+                <w:b w:val="0"/>
+                <w:sz w:val="18"/>
+              </w:rPr>
+              <w:t>+1665</w:t>
             </w:r>
           </w:p>
         </w:tc>
@@ -7435,39 +7470,39 @@
                 <w:b w:val="0"/>
                 <w:sz w:val="18"/>
               </w:rPr>
-              <w:t>-23</w:t>
-            </w:r>
-          </w:p>
-        </w:tc>
-        <w:tc>
-          <w:tcPr>
-            <w:tcW w:type="dxa" w:w="2410"/>
-            <w:shd w:fill="E8F5F1" w:val="clear"/>
-          </w:tcPr>
-          <w:p>
-            <w:r/>
-            <w:r>
-              <w:rPr>
-                <w:b w:val="0"/>
-                <w:sz w:val="18"/>
-              </w:rPr>
-              <w:t>437</w:t>
-            </w:r>
-          </w:p>
-        </w:tc>
-        <w:tc>
-          <w:tcPr>
-            <w:tcW w:type="dxa" w:w="2410"/>
-            <w:shd w:fill="E8F5F1" w:val="clear"/>
-          </w:tcPr>
-          <w:p>
-            <w:r/>
-            <w:r>
-              <w:rPr>
-                <w:b w:val="0"/>
-                <w:sz w:val="18"/>
-              </w:rPr>
-              <w:t>2112</w:t>
+              <w:t>-31</w:t>
+            </w:r>
+          </w:p>
+        </w:tc>
+        <w:tc>
+          <w:tcPr>
+            <w:tcW w:type="dxa" w:w="2410"/>
+            <w:shd w:fill="E8F5F1" w:val="clear"/>
+          </w:tcPr>
+          <w:p>
+            <w:r/>
+            <w:r>
+              <w:rPr>
+                <w:b w:val="0"/>
+                <w:sz w:val="18"/>
+              </w:rPr>
+              <w:t>401</w:t>
+            </w:r>
+          </w:p>
+        </w:tc>
+        <w:tc>
+          <w:tcPr>
+            <w:tcW w:type="dxa" w:w="2410"/>
+            <w:shd w:fill="E8F5F1" w:val="clear"/>
+          </w:tcPr>
+          <w:p>
+            <w:r/>
+            <w:r>
+              <w:rPr>
+                <w:b w:val="0"/>
+                <w:sz w:val="18"/>
+              </w:rPr>
+              <w:t>2066</w:t>
             </w:r>
           </w:p>
         </w:tc>
@@ -7552,7 +7587,7 @@
       <w:r>
         <w:drawing>
           <wp:inline xmlns:a="http://schemas.openxmlformats.org/drawingml/2006/main" xmlns:pic="http://schemas.openxmlformats.org/drawingml/2006/picture">
-            <wp:extent cx="5303520" cy="2853891"/>
+            <wp:extent cx="5303520" cy="2845791"/>
             <wp:docPr id="5" name="Picture 5"/>
             <wp:cNvGraphicFramePr>
               <a:graphicFrameLocks noChangeAspect="1"/>
@@ -7573,7 +7608,7 @@
                   <pic:spPr>
                     <a:xfrm>
                       <a:off x="0" y="0"/>
-                      <a:ext cx="5303520" cy="2853891"/>
+                      <a:ext cx="5303520" cy="2845791"/>
                     </a:xfrm>
                     <a:prstGeom prst="rect"/>
                   </pic:spPr>
@@ -7601,7 +7636,7 @@
       <w:r>
         <w:drawing>
           <wp:inline xmlns:a="http://schemas.openxmlformats.org/drawingml/2006/main" xmlns:pic="http://schemas.openxmlformats.org/drawingml/2006/picture">
-            <wp:extent cx="5303520" cy="2622884"/>
+            <wp:extent cx="5303520" cy="2845791"/>
             <wp:docPr id="6" name="Picture 6"/>
             <wp:cNvGraphicFramePr>
               <a:graphicFrameLocks noChangeAspect="1"/>
@@ -7622,7 +7657,7 @@
                   <pic:spPr>
                     <a:xfrm>
                       <a:off x="0" y="0"/>
-                      <a:ext cx="5303520" cy="2622884"/>
+                      <a:ext cx="5303520" cy="2845791"/>
                     </a:xfrm>
                     <a:prstGeom prst="rect"/>
                   </pic:spPr>
@@ -7650,7 +7685,7 @@
       <w:r>
         <w:drawing>
           <wp:inline xmlns:a="http://schemas.openxmlformats.org/drawingml/2006/main" xmlns:pic="http://schemas.openxmlformats.org/drawingml/2006/picture">
-            <wp:extent cx="5303520" cy="2853891"/>
+            <wp:extent cx="5303520" cy="2845791"/>
             <wp:docPr id="7" name="Picture 7"/>
             <wp:cNvGraphicFramePr>
               <a:graphicFrameLocks noChangeAspect="1"/>
@@ -7671,7 +7706,7 @@
                   <pic:spPr>
                     <a:xfrm>
                       <a:off x="0" y="0"/>
-                      <a:ext cx="5303520" cy="2853891"/>
+                      <a:ext cx="5303520" cy="2845791"/>
                     </a:xfrm>
                     <a:prstGeom prst="rect"/>
                   </pic:spPr>
@@ -7790,7 +7825,7 @@
         <w:rPr>
           <w:sz w:val="22"/>
         </w:rPr>
-        <w:t>Бизнес-план соответствует рекомендуемому объёму 10-40 страниц: основной текст - разделы 1-16; детальные расчёты, таблицы и графики - в приложениях А-Е и в файле 05_Biznes_plan_Prilozheniya.html (для печати в PDF). Дополнительно прилагаются architecture-kravira-fhir-mis.pdf и mvp-presentation.html.</w:t>
+        <w:t>Бизнес-план соответствует рекомендуемому объёму 10-40 страниц: основной текст - разделы 1-17; детальные расчёты, таблицы и графики - в приложениях А-И и в файле 05_Biznes_plan_Prilozheniya.html (для печати в PDF). ML-контур: ml/README.md, scripts/export_training_feedback.py. Дополнительно прилагаются architecture-kravira-fhir-mis.pdf и mvp-presentation.html.</w:t>
       </w:r>
     </w:p>
     <w:p>
@@ -8242,7 +8277,7 @@
                 <w:b w:val="0"/>
                 <w:sz w:val="18"/>
               </w:rPr>
-              <w:t>L1 Базовая</w:t>
+              <w:t>L1 Базовый</w:t>
             </w:r>
           </w:p>
         </w:tc>
@@ -8274,7 +8309,7 @@
                 <w:b w:val="0"/>
                 <w:sz w:val="18"/>
               </w:rPr>
-              <w:t>физлицо</w:t>
+              <w:t>терапия</w:t>
             </w:r>
           </w:p>
         </w:tc>
@@ -8308,14 +8343,80 @@
                 <w:b w:val="0"/>
                 <w:sz w:val="18"/>
               </w:rPr>
-              <w:t>L2 Подробная</w:t>
-            </w:r>
-          </w:p>
-        </w:tc>
-        <w:tc>
-          <w:tcPr>
-            <w:tcW w:type="dxa" w:w="2410"/>
-            <w:shd w:fill="E8F5F1" w:val="clear"/>
+              <w:t>L1+ Расширенный</w:t>
+            </w:r>
+          </w:p>
+        </w:tc>
+        <w:tc>
+          <w:tcPr>
+            <w:tcW w:type="dxa" w:w="2410"/>
+            <w:shd w:fill="E8F5F1" w:val="clear"/>
+          </w:tcPr>
+          <w:p>
+            <w:r/>
+            <w:r>
+              <w:rPr>
+                <w:b w:val="0"/>
+                <w:sz w:val="18"/>
+              </w:rPr>
+              <w:t>6,99 BYN</w:t>
+            </w:r>
+          </w:p>
+        </w:tc>
+        <w:tc>
+          <w:tcPr>
+            <w:tcW w:type="dxa" w:w="2410"/>
+            <w:shd w:fill="E8F5F1" w:val="clear"/>
+          </w:tcPr>
+          <w:p>
+            <w:r/>
+            <w:r>
+              <w:rPr>
+                <w:b w:val="0"/>
+                <w:sz w:val="18"/>
+              </w:rPr>
+              <w:t>специалист+анализы</w:t>
+            </w:r>
+          </w:p>
+        </w:tc>
+      </w:tr>
+      <w:tr>
+        <w:tc>
+          <w:tcPr>
+            <w:tcW w:type="dxa" w:w="2410"/>
+            <w:shd w:fill="FFFFFF" w:val="clear"/>
+          </w:tcPr>
+          <w:p>
+            <w:r/>
+            <w:r>
+              <w:rPr>
+                <w:b w:val="0"/>
+                <w:sz w:val="18"/>
+              </w:rPr>
+              <w:t>B2C</w:t>
+            </w:r>
+          </w:p>
+        </w:tc>
+        <w:tc>
+          <w:tcPr>
+            <w:tcW w:type="dxa" w:w="2410"/>
+            <w:shd w:fill="FFFFFF" w:val="clear"/>
+          </w:tcPr>
+          <w:p>
+            <w:r/>
+            <w:r>
+              <w:rPr>
+                <w:b w:val="0"/>
+                <w:sz w:val="18"/>
+              </w:rPr>
+              <w:t>L2 Стандарт</w:t>
+            </w:r>
+          </w:p>
+        </w:tc>
+        <w:tc>
+          <w:tcPr>
+            <w:tcW w:type="dxa" w:w="2410"/>
+            <w:shd w:fill="FFFFFF" w:val="clear"/>
           </w:tcPr>
           <w:p>
             <w:r/>
@@ -8331,25 +8432,25 @@
         <w:tc>
           <w:tcPr>
             <w:tcW w:type="dxa" w:w="2410"/>
-            <w:shd w:fill="E8F5F1" w:val="clear"/>
-          </w:tcPr>
-          <w:p>
-            <w:r/>
-            <w:r>
-              <w:rPr>
-                <w:b w:val="0"/>
-                <w:sz w:val="18"/>
-              </w:rPr>
-              <w:t>физлицо</w:t>
-            </w:r>
-          </w:p>
-        </w:tc>
-      </w:tr>
-      <w:tr>
-        <w:tc>
-          <w:tcPr>
-            <w:tcW w:type="dxa" w:w="2410"/>
-            <w:shd w:fill="FFFFFF" w:val="clear"/>
+            <w:shd w:fill="FFFFFF" w:val="clear"/>
+          </w:tcPr>
+          <w:p>
+            <w:r/>
+            <w:r>
+              <w:rPr>
+                <w:b w:val="0"/>
+                <w:sz w:val="18"/>
+              </w:rPr>
+              <w:t>подробный разбор</w:t>
+            </w:r>
+          </w:p>
+        </w:tc>
+      </w:tr>
+      <w:tr>
+        <w:tc>
+          <w:tcPr>
+            <w:tcW w:type="dxa" w:w="2410"/>
+            <w:shd w:fill="E8F5F1" w:val="clear"/>
           </w:tcPr>
           <w:p>
             <w:r/>
@@ -8365,48 +8466,180 @@
         <w:tc>
           <w:tcPr>
             <w:tcW w:type="dxa" w:w="2410"/>
-            <w:shd w:fill="FFFFFF" w:val="clear"/>
-          </w:tcPr>
-          <w:p>
-            <w:r/>
-            <w:r>
-              <w:rPr>
-                <w:b w:val="0"/>
-                <w:sz w:val="18"/>
-              </w:rPr>
-              <w:t>Абонемент</w:t>
-            </w:r>
-          </w:p>
-        </w:tc>
-        <w:tc>
-          <w:tcPr>
-            <w:tcW w:type="dxa" w:w="2410"/>
-            <w:shd w:fill="FFFFFF" w:val="clear"/>
-          </w:tcPr>
-          <w:p>
-            <w:r/>
-            <w:r>
-              <w:rPr>
-                <w:b w:val="0"/>
-                <w:sz w:val="18"/>
-              </w:rPr>
-              <w:t>12,99 BYN/мес</w:t>
-            </w:r>
-          </w:p>
-        </w:tc>
-        <w:tc>
-          <w:tcPr>
-            <w:tcW w:type="dxa" w:w="2410"/>
-            <w:shd w:fill="FFFFFF" w:val="clear"/>
-          </w:tcPr>
-          <w:p>
-            <w:r/>
-            <w:r>
-              <w:rPr>
-                <w:b w:val="0"/>
-                <w:sz w:val="18"/>
-              </w:rPr>
-              <w:t>3 проверки</w:t>
+            <w:shd w:fill="E8F5F1" w:val="clear"/>
+          </w:tcPr>
+          <w:p>
+            <w:r/>
+            <w:r>
+              <w:rPr>
+                <w:b w:val="0"/>
+                <w:sz w:val="18"/>
+              </w:rPr>
+              <w:t>L2 Онкология</w:t>
+            </w:r>
+          </w:p>
+        </w:tc>
+        <w:tc>
+          <w:tcPr>
+            <w:tcW w:type="dxa" w:w="2410"/>
+            <w:shd w:fill="E8F5F1" w:val="clear"/>
+          </w:tcPr>
+          <w:p>
+            <w:r/>
+            <w:r>
+              <w:rPr>
+                <w:b w:val="0"/>
+                <w:sz w:val="18"/>
+              </w:rPr>
+              <w:t>14,99 BYN</w:t>
+            </w:r>
+          </w:p>
+        </w:tc>
+        <w:tc>
+          <w:tcPr>
+            <w:tcW w:type="dxa" w:w="2410"/>
+            <w:shd w:fill="E8F5F1" w:val="clear"/>
+          </w:tcPr>
+          <w:p>
+            <w:r/>
+            <w:r>
+              <w:rPr>
+                <w:b w:val="0"/>
+                <w:sz w:val="18"/>
+              </w:rPr>
+              <w:t>онко, ЗНО</w:t>
+            </w:r>
+          </w:p>
+        </w:tc>
+      </w:tr>
+      <w:tr>
+        <w:tc>
+          <w:tcPr>
+            <w:tcW w:type="dxa" w:w="2410"/>
+            <w:shd w:fill="FFFFFF" w:val="clear"/>
+          </w:tcPr>
+          <w:p>
+            <w:r/>
+            <w:r>
+              <w:rPr>
+                <w:b w:val="0"/>
+                <w:sz w:val="18"/>
+              </w:rPr>
+              <w:t>B2C</w:t>
+            </w:r>
+          </w:p>
+        </w:tc>
+        <w:tc>
+          <w:tcPr>
+            <w:tcW w:type="dxa" w:w="2410"/>
+            <w:shd w:fill="FFFFFF" w:val="clear"/>
+          </w:tcPr>
+          <w:p>
+            <w:r/>
+            <w:r>
+              <w:rPr>
+                <w:b w:val="0"/>
+                <w:sz w:val="18"/>
+              </w:rPr>
+              <w:t>L2 Pre-op</w:t>
+            </w:r>
+          </w:p>
+        </w:tc>
+        <w:tc>
+          <w:tcPr>
+            <w:tcW w:type="dxa" w:w="2410"/>
+            <w:shd w:fill="FFFFFF" w:val="clear"/>
+          </w:tcPr>
+          <w:p>
+            <w:r/>
+            <w:r>
+              <w:rPr>
+                <w:b w:val="0"/>
+                <w:sz w:val="18"/>
+              </w:rPr>
+              <w:t>12,99 BYN</w:t>
+            </w:r>
+          </w:p>
+        </w:tc>
+        <w:tc>
+          <w:tcPr>
+            <w:tcW w:type="dxa" w:w="2410"/>
+            <w:shd w:fill="FFFFFF" w:val="clear"/>
+          </w:tcPr>
+          <w:p>
+            <w:r/>
+            <w:r>
+              <w:rPr>
+                <w:b w:val="0"/>
+                <w:sz w:val="18"/>
+              </w:rPr>
+              <w:t>предоперационный</w:t>
+            </w:r>
+          </w:p>
+        </w:tc>
+      </w:tr>
+      <w:tr>
+        <w:tc>
+          <w:tcPr>
+            <w:tcW w:type="dxa" w:w="2410"/>
+            <w:shd w:fill="E8F5F1" w:val="clear"/>
+          </w:tcPr>
+          <w:p>
+            <w:r/>
+            <w:r>
+              <w:rPr>
+                <w:b w:val="0"/>
+                <w:sz w:val="18"/>
+              </w:rPr>
+              <w:t>B2C</w:t>
+            </w:r>
+          </w:p>
+        </w:tc>
+        <w:tc>
+          <w:tcPr>
+            <w:tcW w:type="dxa" w:w="2410"/>
+            <w:shd w:fill="E8F5F1" w:val="clear"/>
+          </w:tcPr>
+          <w:p>
+            <w:r/>
+            <w:r>
+              <w:rPr>
+                <w:b w:val="0"/>
+                <w:sz w:val="18"/>
+              </w:rPr>
+              <w:t>Промо SMS/QR</w:t>
+            </w:r>
+          </w:p>
+        </w:tc>
+        <w:tc>
+          <w:tcPr>
+            <w:tcW w:type="dxa" w:w="2410"/>
+            <w:shd w:fill="E8F5F1" w:val="clear"/>
+          </w:tcPr>
+          <w:p>
+            <w:r/>
+            <w:r>
+              <w:rPr>
+                <w:b w:val="0"/>
+                <w:sz w:val="18"/>
+              </w:rPr>
+              <w:t>2,99 BYN</w:t>
+            </w:r>
+          </w:p>
+        </w:tc>
+        <w:tc>
+          <w:tcPr>
+            <w:tcW w:type="dxa" w:w="2410"/>
+            <w:shd w:fill="E8F5F1" w:val="clear"/>
+          </w:tcPr>
+          <w:p>
+            <w:r/>
+            <w:r>
+              <w:rPr>
+                <w:b w:val="0"/>
+                <w:sz w:val="18"/>
+              </w:rPr>
+              <w:t>rev-share 30% клинике</w:t>
             </w:r>
           </w:p>
         </w:tc>
@@ -9135,7 +9368,7 @@
       <w:r>
         <w:drawing>
           <wp:inline xmlns:a="http://schemas.openxmlformats.org/drawingml/2006/main" xmlns:pic="http://schemas.openxmlformats.org/drawingml/2006/picture">
-            <wp:extent cx="5303520" cy="2853891"/>
+            <wp:extent cx="5303520" cy="2845791"/>
             <wp:docPr id="8" name="Picture 8"/>
             <wp:cNvGraphicFramePr>
               <a:graphicFrameLocks noChangeAspect="1"/>
@@ -9156,7 +9389,7 @@
                   <pic:spPr>
                     <a:xfrm>
                       <a:off x="0" y="0"/>
-                      <a:ext cx="5303520" cy="2853891"/>
+                      <a:ext cx="5303520" cy="2845791"/>
                     </a:xfrm>
                     <a:prstGeom prst="rect"/>
                   </pic:spPr>
@@ -9210,7 +9443,7 @@
       <w:r>
         <w:drawing>
           <wp:inline xmlns:a="http://schemas.openxmlformats.org/drawingml/2006/main" xmlns:pic="http://schemas.openxmlformats.org/drawingml/2006/picture">
-            <wp:extent cx="5303520" cy="5590682"/>
+            <wp:extent cx="5303520" cy="2845791"/>
             <wp:docPr id="9" name="Picture 9"/>
             <wp:cNvGraphicFramePr>
               <a:graphicFrameLocks noChangeAspect="1"/>
@@ -9231,7 +9464,7 @@
                   <pic:spPr>
                     <a:xfrm>
                       <a:off x="0" y="0"/>
-                      <a:ext cx="5303520" cy="5590682"/>
+                      <a:ext cx="5303520" cy="2845791"/>
                     </a:xfrm>
                     <a:prstGeom prst="rect"/>
                   </pic:spPr>
@@ -9285,7 +9518,7 @@
       <w:r>
         <w:drawing>
           <wp:inline xmlns:a="http://schemas.openxmlformats.org/drawingml/2006/main" xmlns:pic="http://schemas.openxmlformats.org/drawingml/2006/picture">
-            <wp:extent cx="5303520" cy="2622884"/>
+            <wp:extent cx="5303520" cy="2845791"/>
             <wp:docPr id="10" name="Picture 10"/>
             <wp:cNvGraphicFramePr>
               <a:graphicFrameLocks noChangeAspect="1"/>
@@ -9306,7 +9539,7 @@
                   <pic:spPr>
                     <a:xfrm>
                       <a:off x="0" y="0"/>
-                      <a:ext cx="5303520" cy="2622884"/>
+                      <a:ext cx="5303520" cy="2845791"/>
                     </a:xfrm>
                     <a:prstGeom prst="rect"/>
                   </pic:spPr>
@@ -9360,7 +9593,7 @@
       <w:r>
         <w:drawing>
           <wp:inline xmlns:a="http://schemas.openxmlformats.org/drawingml/2006/main" xmlns:pic="http://schemas.openxmlformats.org/drawingml/2006/picture">
-            <wp:extent cx="5303520" cy="2843766"/>
+            <wp:extent cx="5303520" cy="2845791"/>
             <wp:docPr id="11" name="Picture 11"/>
             <wp:cNvGraphicFramePr>
               <a:graphicFrameLocks noChangeAspect="1"/>
@@ -9381,7 +9614,7 @@
                   <pic:spPr>
                     <a:xfrm>
                       <a:off x="0" y="0"/>
-                      <a:ext cx="5303520" cy="2843766"/>
+                      <a:ext cx="5303520" cy="2845791"/>
                     </a:xfrm>
                     <a:prstGeom prst="rect"/>
                   </pic:spPr>
@@ -9435,7 +9668,7 @@
       <w:r>
         <w:drawing>
           <wp:inline xmlns:a="http://schemas.openxmlformats.org/drawingml/2006/main" xmlns:pic="http://schemas.openxmlformats.org/drawingml/2006/picture">
-            <wp:extent cx="5303520" cy="2402325"/>
+            <wp:extent cx="5303520" cy="2845791"/>
             <wp:docPr id="12" name="Picture 12"/>
             <wp:cNvGraphicFramePr>
               <a:graphicFrameLocks noChangeAspect="1"/>
@@ -9456,7 +9689,7 @@
                   <pic:spPr>
                     <a:xfrm>
                       <a:off x="0" y="0"/>
-                      <a:ext cx="5303520" cy="2402325"/>
+                      <a:ext cx="5303520" cy="2845791"/>
                     </a:xfrm>
                     <a:prstGeom prst="rect"/>
                   </pic:spPr>
@@ -9474,6 +9707,398 @@
     </w:p>
     <w:p>
       <w:pPr>
+        <w:spacing w:before="280" w:after="80"/>
+      </w:pPr>
+      <w:r>
+        <w:rPr>
+          <w:b/>
+          <w:i w:val="0"/>
+          <w:sz w:val="24"/>
+        </w:rPr>
+        <w:t>Приложение И. ML-контур и непрерывное дообучение</w:t>
+      </w:r>
+    </w:p>
+    <w:p>
+      <w:pPr>
+        <w:spacing w:before="120" w:after="120"/>
+      </w:pPr>
+      <w:r>
+        <w:rPr>
+          <w:b w:val="0"/>
+          <w:i w:val="0"/>
+          <w:sz w:val="20"/>
+        </w:rPr>
+        <w:t>Каркас ml/, сбор feedback, export_training_feedback.py, on-prem fine-tune.</w:t>
+      </w:r>
+    </w:p>
+    <w:tbl>
+      <w:tblPr>
+        <w:tblStyle w:val="a3"/>
+        <w:tblW w:type="auto" w:w="0"/>
+        <w:tblLook w:firstColumn="1" w:firstRow="1" w:lastColumn="0" w:lastRow="0" w:noHBand="0" w:noVBand="1" w:val="04A0"/>
+      </w:tblPr>
+      <w:tblGrid>
+        <w:gridCol w:w="3213"/>
+        <w:gridCol w:w="3213"/>
+        <w:gridCol w:w="3213"/>
+      </w:tblGrid>
+      <w:tr>
+        <w:tc>
+          <w:tcPr>
+            <w:tcW w:type="dxa" w:w="3213"/>
+            <w:shd w:fill="126B5C" w:val="clear"/>
+          </w:tcPr>
+          <w:p>
+            <w:r/>
+            <w:r>
+              <w:rPr>
+                <w:b/>
+                <w:color w:val="FFFFFF"/>
+                <w:sz w:val="18"/>
+              </w:rPr>
+              <w:t>Компонент</w:t>
+            </w:r>
+          </w:p>
+        </w:tc>
+        <w:tc>
+          <w:tcPr>
+            <w:tcW w:type="dxa" w:w="3213"/>
+            <w:shd w:fill="126B5C" w:val="clear"/>
+          </w:tcPr>
+          <w:p>
+            <w:r/>
+            <w:r>
+              <w:rPr>
+                <w:b/>
+                <w:color w:val="FFFFFF"/>
+                <w:sz w:val="18"/>
+              </w:rPr>
+              <w:t>Механизм</w:t>
+            </w:r>
+          </w:p>
+        </w:tc>
+        <w:tc>
+          <w:tcPr>
+            <w:tcW w:type="dxa" w:w="3213"/>
+            <w:shd w:fill="126B5C" w:val="clear"/>
+          </w:tcPr>
+          <w:p>
+            <w:r/>
+            <w:r>
+              <w:rPr>
+                <w:b/>
+                <w:color w:val="FFFFFF"/>
+                <w:sz w:val="18"/>
+              </w:rPr>
+              <w:t>Обучение</w:t>
+            </w:r>
+          </w:p>
+        </w:tc>
+      </w:tr>
+      <w:tr>
+        <w:tc>
+          <w:tcPr>
+            <w:tcW w:type="dxa" w:w="3213"/>
+            <w:shd w:fill="FFFFFF" w:val="clear"/>
+          </w:tcPr>
+          <w:p>
+            <w:r/>
+            <w:r>
+              <w:rPr>
+                <w:b w:val="0"/>
+                <w:sz w:val="18"/>
+              </w:rPr>
+              <w:t>send_gate</w:t>
+            </w:r>
+          </w:p>
+        </w:tc>
+        <w:tc>
+          <w:tcPr>
+            <w:tcW w:type="dxa" w:w="3213"/>
+            <w:shd w:fill="FFFFFF" w:val="clear"/>
+          </w:tcPr>
+          <w:p>
+            <w:r/>
+            <w:r>
+              <w:rPr>
+                <w:b w:val="0"/>
+                <w:sz w:val="18"/>
+              </w:rPr>
+              <w:t>правила</w:t>
+            </w:r>
+          </w:p>
+        </w:tc>
+        <w:tc>
+          <w:tcPr>
+            <w:tcW w:type="dxa" w:w="3213"/>
+            <w:shd w:fill="FFFFFF" w:val="clear"/>
+          </w:tcPr>
+          <w:p>
+            <w:r/>
+            <w:r>
+              <w:rPr>
+                <w:b w:val="0"/>
+                <w:sz w:val="18"/>
+              </w:rPr>
+              <w:t>не обучается</w:t>
+            </w:r>
+          </w:p>
+        </w:tc>
+      </w:tr>
+      <w:tr>
+        <w:tc>
+          <w:tcPr>
+            <w:tcW w:type="dxa" w:w="3213"/>
+            <w:shd w:fill="E8F5F1" w:val="clear"/>
+          </w:tcPr>
+          <w:p>
+            <w:r/>
+            <w:r>
+              <w:rPr>
+                <w:b w:val="0"/>
+                <w:sz w:val="18"/>
+              </w:rPr>
+              <w:t>RAG</w:t>
+            </w:r>
+          </w:p>
+        </w:tc>
+        <w:tc>
+          <w:tcPr>
+            <w:tcW w:type="dxa" w:w="3213"/>
+            <w:shd w:fill="E8F5F1" w:val="clear"/>
+          </w:tcPr>
+          <w:p>
+            <w:r/>
+            <w:r>
+              <w:rPr>
+                <w:b w:val="0"/>
+                <w:sz w:val="18"/>
+              </w:rPr>
+              <w:t>embedder + reranker</w:t>
+            </w:r>
+          </w:p>
+        </w:tc>
+        <w:tc>
+          <w:tcPr>
+            <w:tcW w:type="dxa" w:w="3213"/>
+            <w:shd w:fill="E8F5F1" w:val="clear"/>
+          </w:tcPr>
+          <w:p>
+            <w:r/>
+            <w:r>
+              <w:rPr>
+                <w:b w:val="0"/>
+                <w:sz w:val="18"/>
+              </w:rPr>
+              <w:t>LoRA ежемесячно</w:t>
+            </w:r>
+          </w:p>
+        </w:tc>
+      </w:tr>
+      <w:tr>
+        <w:tc>
+          <w:tcPr>
+            <w:tcW w:type="dxa" w:w="3213"/>
+            <w:shd w:fill="FFFFFF" w:val="clear"/>
+          </w:tcPr>
+          <w:p>
+            <w:r/>
+            <w:r>
+              <w:rPr>
+                <w:b w:val="0"/>
+                <w:sz w:val="18"/>
+              </w:rPr>
+              <w:t>required_exam</w:t>
+            </w:r>
+          </w:p>
+        </w:tc>
+        <w:tc>
+          <w:tcPr>
+            <w:tcW w:type="dxa" w:w="3213"/>
+            <w:shd w:fill="FFFFFF" w:val="clear"/>
+          </w:tcPr>
+          <w:p>
+            <w:r/>
+            <w:r>
+              <w:rPr>
+                <w:b w:val="0"/>
+                <w:sz w:val="18"/>
+              </w:rPr>
+              <w:t>entailment</w:t>
+            </w:r>
+          </w:p>
+        </w:tc>
+        <w:tc>
+          <w:tcPr>
+            <w:tcW w:type="dxa" w:w="3213"/>
+            <w:shd w:fill="FFFFFF" w:val="clear"/>
+          </w:tcPr>
+          <w:p>
+            <w:r/>
+            <w:r>
+              <w:rPr>
+                <w:b w:val="0"/>
+                <w:sz w:val="18"/>
+              </w:rPr>
+              <w:t>метки методиста</w:t>
+            </w:r>
+          </w:p>
+        </w:tc>
+      </w:tr>
+      <w:tr>
+        <w:tc>
+          <w:tcPr>
+            <w:tcW w:type="dxa" w:w="3213"/>
+            <w:shd w:fill="E8F5F1" w:val="clear"/>
+          </w:tcPr>
+          <w:p>
+            <w:r/>
+            <w:r>
+              <w:rPr>
+                <w:b w:val="0"/>
+                <w:sz w:val="18"/>
+              </w:rPr>
+              <w:t>Summary cards</w:t>
+            </w:r>
+          </w:p>
+        </w:tc>
+        <w:tc>
+          <w:tcPr>
+            <w:tcW w:type="dxa" w:w="3213"/>
+            <w:shd w:fill="E8F5F1" w:val="clear"/>
+          </w:tcPr>
+          <w:p>
+            <w:r/>
+            <w:r>
+              <w:rPr>
+                <w:b w:val="0"/>
+                <w:sz w:val="18"/>
+              </w:rPr>
+              <w:t>extractor</w:t>
+            </w:r>
+          </w:p>
+        </w:tc>
+        <w:tc>
+          <w:tcPr>
+            <w:tcW w:type="dxa" w:w="3213"/>
+            <w:shd w:fill="E8F5F1" w:val="clear"/>
+          </w:tcPr>
+          <w:p>
+            <w:r/>
+            <w:r>
+              <w:rPr>
+                <w:b w:val="0"/>
+                <w:sz w:val="18"/>
+              </w:rPr>
+              <w:t>approved drafts</w:t>
+            </w:r>
+          </w:p>
+        </w:tc>
+      </w:tr>
+      <w:tr>
+        <w:tc>
+          <w:tcPr>
+            <w:tcW w:type="dxa" w:w="3213"/>
+            <w:shd w:fill="FFFFFF" w:val="clear"/>
+          </w:tcPr>
+          <w:p>
+            <w:r/>
+            <w:r>
+              <w:rPr>
+                <w:b w:val="0"/>
+                <w:sz w:val="18"/>
+              </w:rPr>
+              <w:t>Фаза 0</w:t>
+            </w:r>
+          </w:p>
+        </w:tc>
+        <w:tc>
+          <w:tcPr>
+            <w:tcW w:type="dxa" w:w="3213"/>
+            <w:shd w:fill="FFFFFF" w:val="clear"/>
+          </w:tcPr>
+          <w:p>
+            <w:r/>
+            <w:r>
+              <w:rPr>
+                <w:b w:val="0"/>
+                <w:sz w:val="18"/>
+              </w:rPr>
+              <w:t>2026</w:t>
+            </w:r>
+          </w:p>
+        </w:tc>
+        <w:tc>
+          <w:tcPr>
+            <w:tcW w:type="dxa" w:w="3213"/>
+            <w:shd w:fill="FFFFFF" w:val="clear"/>
+          </w:tcPr>
+          <w:p>
+            <w:r/>
+            <w:r>
+              <w:rPr>
+                <w:b w:val="0"/>
+                <w:sz w:val="18"/>
+              </w:rPr>
+              <w:t>feedback + export</w:t>
+            </w:r>
+          </w:p>
+        </w:tc>
+      </w:tr>
+      <w:tr>
+        <w:tc>
+          <w:tcPr>
+            <w:tcW w:type="dxa" w:w="3213"/>
+            <w:shd w:fill="E8F5F1" w:val="clear"/>
+          </w:tcPr>
+          <w:p>
+            <w:r/>
+            <w:r>
+              <w:rPr>
+                <w:b w:val="0"/>
+                <w:sz w:val="18"/>
+              </w:rPr>
+              <w:t>Фаза 1</w:t>
+            </w:r>
+          </w:p>
+        </w:tc>
+        <w:tc>
+          <w:tcPr>
+            <w:tcW w:type="dxa" w:w="3213"/>
+            <w:shd w:fill="E8F5F1" w:val="clear"/>
+          </w:tcPr>
+          <w:p>
+            <w:r/>
+            <w:r>
+              <w:rPr>
+                <w:b w:val="0"/>
+                <w:sz w:val="18"/>
+              </w:rPr>
+              <w:t>Q4 2026</w:t>
+            </w:r>
+          </w:p>
+        </w:tc>
+        <w:tc>
+          <w:tcPr>
+            <w:tcW w:type="dxa" w:w="3213"/>
+            <w:shd w:fill="E8F5F1" w:val="clear"/>
+          </w:tcPr>
+          <w:p>
+            <w:r/>
+            <w:r>
+              <w:rPr>
+                <w:b w:val="0"/>
+                <w:sz w:val="18"/>
+              </w:rPr>
+              <w:t>local embedder on-prem</w:t>
+            </w:r>
+          </w:p>
+        </w:tc>
+      </w:tr>
+    </w:tbl>
+    <w:p/>
+    <w:p>
+      <w:pPr>
         <w:widowControl w:val="0"/>
         <w:autoSpaceDE w:val="0"/>
         <w:autoSpaceDN w:val="0"/>
@@ -9877,6 +10502,42 @@
           <w:sz w:val="24"/>
         </w:rPr>
         <w:t>Заверяется печатью юридического лица. Печать может не проставляться организациями, которые в соответствии с законодательными актами вправе не использовать печати.</w:t>
+      </w:r>
+    </w:p>
+    <w:p>
+      <w:r>
+        <w:t>Непрерывное дообучение - стратегия развития Protocol после пилота в МЦ «Кравира». Продукт не заменяет</w:t>
+        <w:br/>
+        <w:t>детерминированное ядро (send_gate, CISZ) нейросетью: модели улучшают retrieval, medical entailment</w:t>
+        <w:br/>
+        <w:t>и structured extraction, а решение о подписи остаётся воспроизводимым по правилам с evidence_map.</w:t>
+        <w:br/>
+        <w:br/>
+        <w:t>Три уровня ML в продукте:</w:t>
+        <w:br/>
+        <w:t>1) RAG - domain embedder + cross-encoder reranker на корпусе ~478 КП Минздрава (on-prem, без Gemini на L0).</w:t>
+        <w:br/>
+        <w:t>2) Сопоставление терминов КЗ - entailment-модель по меткам методслужбы (required_exam, keyword rules).</w:t>
+        <w:br/>
+        <w:t>3) Summary cards - student-модель на approved карточках протоколов (human-in-the-loop).</w:t>
+        <w:br/>
+        <w:br/>
+        <w:t>Цикл данных: production L0-L2 → data/ml/feedback/ (hash, scores, overrides) → export_training_feedback.py</w:t>
+        <w:br/>
+        <w:t>→ ml/datasets/ → LoRA fine-tune → eval (golden queries + consult_gold) → ml/registry/model_manifest.json.</w:t>
+        <w:br/>
+        <w:br/>
+        <w:t>Дорожная карта: фаза 0 (2026) - сбор feedback; фаза 1 - local embedder; фаза 2 - reranker + entailment;</w:t>
+        <w:br/>
+        <w:t>фаза 3 - hybrid summary cards; фаза 4 - ежемесячный retrain и A/B на сети частных ОЗ.</w:t>
+        <w:br/>
+        <w:br/>
+        <w:t>Конкурентное преимущество: поток ~25 000 КЗ/мес в Кравире как источник меток + официальный корпус КП РБ.</w:t>
+        <w:br/>
+        <w:t>Сертификат ГКНТ направлен также на запуск ML-контура в защищённом контуре РБ.</w:t>
+        <w:br/>
+        <w:br/>
+        <w:t>Подробные таблицы принципов, roadmap и артефактов - приложение И и ml/README.md.</w:t>
       </w:r>
     </w:p>
     <w:sectPr>

</xml_diff>

<commit_message>
Use neutral LLM wording and fix chart legends in konkurs PDFs.
Replace vendor names in BP texts, clarify ML is framework-only in 2026, move Plotly legends below charts to avoid overlap, and regenerate konkurs assets.

Co-authored-by: Cursor <cursoragent@cursor.com>
</commit_message>
<xml_diff>
--- a/docs/konkurs/03_Biznes_plan_Kravira_Protocol.docx
+++ b/docs/konkurs/03_Biznes_plan_Kravira_Protocol.docx
@@ -1721,7 +1721,7 @@
       <w:r>
         <w:drawing>
           <wp:inline xmlns:a="http://schemas.openxmlformats.org/drawingml/2006/main" xmlns:pic="http://schemas.openxmlformats.org/drawingml/2006/picture">
-            <wp:extent cx="5303520" cy="2845791"/>
+            <wp:extent cx="5303520" cy="3026887"/>
             <wp:docPr id="2" name="Picture 2"/>
             <wp:cNvGraphicFramePr>
               <a:graphicFrameLocks noChangeAspect="1"/>
@@ -1742,7 +1742,7 @@
                   <pic:spPr>
                     <a:xfrm>
                       <a:off x="0" y="0"/>
-                      <a:ext cx="5303520" cy="2845791"/>
+                      <a:ext cx="5303520" cy="3026887"/>
                     </a:xfrm>
                     <a:prstGeom prst="rect"/>
                   </pic:spPr>
@@ -4111,7 +4111,7 @@
                 <w:b w:val="0"/>
                 <w:sz w:val="18"/>
               </w:rPr>
-              <w:t>ChatGPT / общие LLM</w:t>
+              <w:t>Свободные LLM-чаты</w:t>
             </w:r>
           </w:p>
         </w:tc>
@@ -4874,7 +4874,7 @@
         <w:br/>
         <w:t>- платёжные агрегаторы для B2C (ERIP, эквайринг банков РБ);</w:t>
         <w:br/>
-        <w:t>- опционально API языковой модели (Gemini) или on-prem LLM для уровня L2;</w:t>
+        <w:t>- опционально облачный LLM API или on-prem LLM для уровня L2;</w:t>
         <w:br/>
         <w:t>- НЦИС (БелГИСС) - регистрация программы для ЭВМ;</w:t>
         <w:br/>
@@ -7587,7 +7587,7 @@
       <w:r>
         <w:drawing>
           <wp:inline xmlns:a="http://schemas.openxmlformats.org/drawingml/2006/main" xmlns:pic="http://schemas.openxmlformats.org/drawingml/2006/picture">
-            <wp:extent cx="5303520" cy="2845791"/>
+            <wp:extent cx="5303520" cy="3026887"/>
             <wp:docPr id="5" name="Picture 5"/>
             <wp:cNvGraphicFramePr>
               <a:graphicFrameLocks noChangeAspect="1"/>
@@ -7608,7 +7608,7 @@
                   <pic:spPr>
                     <a:xfrm>
                       <a:off x="0" y="0"/>
-                      <a:ext cx="5303520" cy="2845791"/>
+                      <a:ext cx="5303520" cy="3026887"/>
                     </a:xfrm>
                     <a:prstGeom prst="rect"/>
                   </pic:spPr>
@@ -7685,7 +7685,7 @@
       <w:r>
         <w:drawing>
           <wp:inline xmlns:a="http://schemas.openxmlformats.org/drawingml/2006/main" xmlns:pic="http://schemas.openxmlformats.org/drawingml/2006/picture">
-            <wp:extent cx="5303520" cy="2845791"/>
+            <wp:extent cx="5303520" cy="3026887"/>
             <wp:docPr id="7" name="Picture 7"/>
             <wp:cNvGraphicFramePr>
               <a:graphicFrameLocks noChangeAspect="1"/>
@@ -7706,7 +7706,7 @@
                   <pic:spPr>
                     <a:xfrm>
                       <a:off x="0" y="0"/>
-                      <a:ext cx="5303520" cy="2845791"/>
+                      <a:ext cx="5303520" cy="3026887"/>
                     </a:xfrm>
                     <a:prstGeom prst="rect"/>
                   </pic:spPr>
@@ -9368,7 +9368,7 @@
       <w:r>
         <w:drawing>
           <wp:inline xmlns:a="http://schemas.openxmlformats.org/drawingml/2006/main" xmlns:pic="http://schemas.openxmlformats.org/drawingml/2006/picture">
-            <wp:extent cx="5303520" cy="2845791"/>
+            <wp:extent cx="5303520" cy="3026887"/>
             <wp:docPr id="8" name="Picture 8"/>
             <wp:cNvGraphicFramePr>
               <a:graphicFrameLocks noChangeAspect="1"/>
@@ -9389,7 +9389,7 @@
                   <pic:spPr>
                     <a:xfrm>
                       <a:off x="0" y="0"/>
-                      <a:ext cx="5303520" cy="2845791"/>
+                      <a:ext cx="5303520" cy="3026887"/>
                     </a:xfrm>
                     <a:prstGeom prst="rect"/>
                   </pic:spPr>
@@ -9443,7 +9443,7 @@
       <w:r>
         <w:drawing>
           <wp:inline xmlns:a="http://schemas.openxmlformats.org/drawingml/2006/main" xmlns:pic="http://schemas.openxmlformats.org/drawingml/2006/picture">
-            <wp:extent cx="5303520" cy="2845791"/>
+            <wp:extent cx="5303520" cy="3026887"/>
             <wp:docPr id="9" name="Picture 9"/>
             <wp:cNvGraphicFramePr>
               <a:graphicFrameLocks noChangeAspect="1"/>
@@ -9464,7 +9464,7 @@
                   <pic:spPr>
                     <a:xfrm>
                       <a:off x="0" y="0"/>
-                      <a:ext cx="5303520" cy="2845791"/>
+                      <a:ext cx="5303520" cy="3026887"/>
                     </a:xfrm>
                     <a:prstGeom prst="rect"/>
                   </pic:spPr>
@@ -10513,9 +10513,16 @@
         <w:t>и structured extraction, а решение о подписи остаётся воспроизводимым по правилам с evidence_map.</w:t>
         <w:br/>
         <w:br/>
+        <w:t>Статус на 2026: в production работают детерминированные правила (482+), semantic RAG и опциональные вызовы LLM;</w:t>
+        <w:br/>
+        <w:t>каталог ml/ - каркас MLOps (сбор feedback, export_training_feedback.py, заглушки train/eval). Полный цикл</w:t>
+        <w:br/>
+        <w:t>LoRA fine-tune и деплой локальных моделей - фаза 1 дорожной карты (Q4 2026), не текущий релиз.</w:t>
+        <w:br/>
+        <w:br/>
         <w:t>Три уровня ML в продукте:</w:t>
         <w:br/>
-        <w:t>1) RAG - domain embedder + cross-encoder reranker на корпусе ~478 КП Минздрава (on-prem, без Gemini на L0).</w:t>
+        <w:t>1) RAG - domain embedder + cross-encoder reranker на корпусе ~478 КП Минздрава (on-prem, без облачного LLM на L0).</w:t>
         <w:br/>
         <w:t>2) Сопоставление терминов КЗ - entailment-модель по меткам методслужбы (required_exam, keyword rules).</w:t>
         <w:br/>

</xml_diff>

<commit_message>
Add KZ/RAG A/B embedder test and update business plan with ML results.
Run ab_kz_embedder comparing baseline vs fine-tuned e5 on consult_gold and golden retrieve; document offline MRR gains and honest zero delta on end-to-end KZ metrics in BP section 17 and appendix I.

Co-authored-by: Cursor <cursoragent@cursor.com>
</commit_message>
<xml_diff>
--- a/docs/konkurs/03_Biznes_plan_Kravira_Protocol.docx
+++ b/docs/konkurs/03_Biznes_plan_Kravira_Protocol.docx
@@ -9728,7 +9728,7 @@
           <w:i w:val="0"/>
           <w:sz w:val="20"/>
         </w:rPr>
-        <w:t>Каркас ml/, сбор feedback, export_training_feedback.py, on-prem fine-tune.</w:t>
+        <w:t>Каркас ml/, fine-tune e5, A/B consult_gold; отчёты ml/experiments/.</w:t>
       </w:r>
     </w:p>
     <w:tbl>
@@ -9890,7 +9890,7 @@
                 <w:b w:val="0"/>
                 <w:sz w:val="18"/>
               </w:rPr>
-              <w:t>LoRA ежемесячно</w:t>
+              <w:t>LoRA, exp. MRR +0,29</w:t>
             </w:r>
           </w:p>
         </w:tc>
@@ -9958,89 +9958,89 @@
                 <w:b w:val="0"/>
                 <w:sz w:val="18"/>
               </w:rPr>
-              <w:t>Summary cards</w:t>
-            </w:r>
-          </w:p>
-        </w:tc>
-        <w:tc>
-          <w:tcPr>
-            <w:tcW w:type="dxa" w:w="3213"/>
-            <w:shd w:fill="E8F5F1" w:val="clear"/>
-          </w:tcPr>
-          <w:p>
-            <w:r/>
-            <w:r>
-              <w:rPr>
-                <w:b w:val="0"/>
-                <w:sz w:val="18"/>
-              </w:rPr>
-              <w:t>extractor</w:t>
-            </w:r>
-          </w:p>
-        </w:tc>
-        <w:tc>
-          <w:tcPr>
-            <w:tcW w:type="dxa" w:w="3213"/>
-            <w:shd w:fill="E8F5F1" w:val="clear"/>
-          </w:tcPr>
-          <w:p>
-            <w:r/>
-            <w:r>
-              <w:rPr>
-                <w:b w:val="0"/>
-                <w:sz w:val="18"/>
-              </w:rPr>
-              <w:t>approved drafts</w:t>
-            </w:r>
-          </w:p>
-        </w:tc>
-      </w:tr>
-      <w:tr>
-        <w:tc>
-          <w:tcPr>
-            <w:tcW w:type="dxa" w:w="3213"/>
-            <w:shd w:fill="FFFFFF" w:val="clear"/>
-          </w:tcPr>
-          <w:p>
-            <w:r/>
-            <w:r>
-              <w:rPr>
-                <w:b w:val="0"/>
-                <w:sz w:val="18"/>
-              </w:rPr>
-              <w:t>Фаза 0</w:t>
-            </w:r>
-          </w:p>
-        </w:tc>
-        <w:tc>
-          <w:tcPr>
-            <w:tcW w:type="dxa" w:w="3213"/>
-            <w:shd w:fill="FFFFFF" w:val="clear"/>
-          </w:tcPr>
-          <w:p>
-            <w:r/>
-            <w:r>
-              <w:rPr>
-                <w:b w:val="0"/>
-                <w:sz w:val="18"/>
-              </w:rPr>
-              <w:t>2026</w:t>
-            </w:r>
-          </w:p>
-        </w:tc>
-        <w:tc>
-          <w:tcPr>
-            <w:tcW w:type="dxa" w:w="3213"/>
-            <w:shd w:fill="FFFFFF" w:val="clear"/>
-          </w:tcPr>
-          <w:p>
-            <w:r/>
-            <w:r>
-              <w:rPr>
-                <w:b w:val="0"/>
-                <w:sz w:val="18"/>
-              </w:rPr>
-              <w:t>feedback + export</w:t>
+              <w:t>A/B KZ RAG</w:t>
+            </w:r>
+          </w:p>
+        </w:tc>
+        <w:tc>
+          <w:tcPr>
+            <w:tcW w:type="dxa" w:w="3213"/>
+            <w:shd w:fill="E8F5F1" w:val="clear"/>
+          </w:tcPr>
+          <w:p>
+            <w:r/>
+            <w:r>
+              <w:rPr>
+                <w:b w:val="0"/>
+                <w:sz w:val="18"/>
+              </w:rPr>
+              <w:t>топ-5 КП</w:t>
+            </w:r>
+          </w:p>
+        </w:tc>
+        <w:tc>
+          <w:tcPr>
+            <w:tcW w:type="dxa" w:w="3213"/>
+            <w:shd w:fill="E8F5F1" w:val="clear"/>
+          </w:tcPr>
+          <w:p>
+            <w:r/>
+            <w:r>
+              <w:rPr>
+                <w:b w:val="0"/>
+                <w:sz w:val="18"/>
+              </w:rPr>
+              <w:t>100% / 100%</w:t>
+            </w:r>
+          </w:p>
+        </w:tc>
+      </w:tr>
+      <w:tr>
+        <w:tc>
+          <w:tcPr>
+            <w:tcW w:type="dxa" w:w="3213"/>
+            <w:shd w:fill="FFFFFF" w:val="clear"/>
+          </w:tcPr>
+          <w:p>
+            <w:r/>
+            <w:r>
+              <w:rPr>
+                <w:b w:val="0"/>
+                <w:sz w:val="18"/>
+              </w:rPr>
+              <w:t>A/B golden</w:t>
+            </w:r>
+          </w:p>
+        </w:tc>
+        <w:tc>
+          <w:tcPr>
+            <w:tcW w:type="dxa" w:w="3213"/>
+            <w:shd w:fill="FFFFFF" w:val="clear"/>
+          </w:tcPr>
+          <w:p>
+            <w:r/>
+            <w:r>
+              <w:rPr>
+                <w:b w:val="0"/>
+                <w:sz w:val="18"/>
+              </w:rPr>
+              <w:t>retrieve 18</w:t>
+            </w:r>
+          </w:p>
+        </w:tc>
+        <w:tc>
+          <w:tcPr>
+            <w:tcW w:type="dxa" w:w="3213"/>
+            <w:shd w:fill="FFFFFF" w:val="clear"/>
+          </w:tcPr>
+          <w:p>
+            <w:r/>
+            <w:r>
+              <w:rPr>
+                <w:b w:val="0"/>
+                <w:sz w:val="18"/>
+              </w:rPr>
+              <w:t>77,8% / 77,8%</w:t>
             </w:r>
           </w:p>
         </w:tc>
@@ -10090,7 +10090,7 @@
                 <w:b w:val="0"/>
                 <w:sz w:val="18"/>
               </w:rPr>
-              <w:t>local embedder on-prem</w:t>
+              <w:t>деплой local embedder</w:t>
             </w:r>
           </w:p>
         </w:tc>
@@ -10513,11 +10513,13 @@
         <w:t>и structured extraction, а решение о подписи остаётся воспроизводимым по правилам с evidence_map.</w:t>
         <w:br/>
         <w:br/>
-        <w:t>Статус на 2026: в production работают детерминированные правила (482+), semantic RAG и опциональные вызовы LLM;</w:t>
-        <w:br/>
-        <w:t>каталог ml/ - каркас MLOps (сбор feedback, export_training_feedback.py, заглушки train/eval). Полный цикл</w:t>
-        <w:br/>
-        <w:t>LoRA fine-tune и деплой локальных моделей - фаза 1 дорожной карты (Q4 2026), не текущий релиз.</w:t>
+        <w:t>Статус на 2026: выполнен первый цикл ML - export 313 пар, fine-tune local embedder (e5-small),</w:t>
+        <w:br/>
+        <w:t>офлайн MRR@10 вырос с 0,12 до 0,41 (5-fold CV); A/B на consult_gold и golden RAG в полном retrieve():</w:t>
+        <w:br/>
+        <w:t>rule checker 9/9 (100%) без изменений; RAG по тексту КЗ 9/9 (100%) на обоих плечах; golden 14/18 (77,8%) -</w:t>
+        <w:br/>
+        <w:t>без прироста на текущих метриках (гастро-КЗ уже однозначны для лексического+semantic поиска).</w:t>
         <w:br/>
         <w:br/>
         <w:t>Три уровня ML в продукте:</w:t>
@@ -10529,22 +10531,15 @@
         <w:t>3) Summary cards - student-модель на approved карточках протоколов (human-in-the-loop).</w:t>
         <w:br/>
         <w:br/>
-        <w:t>Цикл данных: production L0-L2 → data/ml/feedback/ (hash, scores, overrides) → export_training_feedback.py</w:t>
-        <w:br/>
-        <w:t>→ ml/datasets/ → LoRA fine-tune → eval (golden queries + consult_gold) → ml/registry/model_manifest.json.</w:t>
-        <w:br/>
-        <w:br/>
-        <w:t>Дорожная карта: фаза 0 (2026) - сбор feedback; фаза 1 - local embedder; фаза 2 - reranker + entailment;</w:t>
-        <w:br/>
-        <w:t>фаза 3 - hybrid summary cards; фаза 4 - ежемесячный retrain и A/B на сети частных ОЗ.</w:t>
-        <w:br/>
-        <w:br/>
-        <w:t>Конкурентное преимущество: поток ~25 000 КЗ/мес в Кравире как источник меток + официальный корпус КП РБ.</w:t>
-        <w:br/>
-        <w:t>Сертификат ГКНТ направлен также на запуск ML-контура в защищённом контуре РБ.</w:t>
-        <w:br/>
-        <w:br/>
-        <w:t>Подробные таблицы принципов, roadmap и артефактов - приложение И и ml/README.md.</w:t>
+        <w:t>Цикл данных: production L0-L2 → data/ml/feedback/ → export_training_feedback.py → ml/datasets/</w:t>
+        <w:br/>
+        <w:t>→ fine-tune → eval (golden + consult_gold) → ml/registry/model_manifest.json → деплой local embedder.</w:t>
+        <w:br/>
+        <w:br/>
+        <w:t>Следующий шаг пилота: retrieval_fix от методиста, reranker, закрытие 4 провалов golden (E11, K85, I50).</w:t>
+        <w:br/>
+        <w:br/>
+        <w:t>Подробные таблицы эксперимента, A/B и roadmap - приложение И, ml/experiments/.</w:t>
       </w:r>
     </w:p>
     <w:sectPr>

</xml_diff>